<commit_message>
dados: saídas regeneradas com consumo e compras (cadeia rodar-modelo.sh tudo)
JSONs do painel, memória de cálculo, painel de municípios, Seguro-Receita, resultados
consolidados, planilhas, auditoria e tabelas do artigo do Paraná, regenerados com o
modelo que integra a função de consumo e as compras governamentais.

Co-Authored-By: Claude Sonnet 5.5 <noreply@anthropic.com>
Claude-Session: https://claude.ai/code/session_011eEoECqArDQbSEYFrfCHxJ
</commit_message>
<xml_diff>
--- a/data/auditoria-pr-validacao/tabelas-artigo/tabela-cenarios-receita-estadual-pr.docx
+++ b/data/auditoria-pr-validacao/tabelas-artigo/tabela-cenarios-receita-estadual-pr.docx
@@ -509,7 +509,7 @@
                 <w:b w:val="0"/>
                 <w:sz w:val="18"/>
               </w:rPr>
-              <w:t>−103</w:t>
+              <w:t>−104</w:t>
             </w:r>
           </w:p>
         </w:tc>
@@ -720,7 +720,7 @@
                 <w:b w:val="0"/>
                 <w:sz w:val="18"/>
               </w:rPr>
-              <w:t>−122</w:t>
+              <w:t>−123</w:t>
             </w:r>
           </w:p>
         </w:tc>
@@ -931,7 +931,7 @@
                 <w:b w:val="0"/>
                 <w:sz w:val="18"/>
               </w:rPr>
-              <w:t>−142</w:t>
+              <w:t>−144</w:t>
             </w:r>
           </w:p>
         </w:tc>
@@ -1142,7 +1142,7 @@
                 <w:b w:val="0"/>
                 <w:sz w:val="18"/>
               </w:rPr>
-              <w:t>−162</w:t>
+              <w:t>−165</w:t>
             </w:r>
           </w:p>
         </w:tc>
@@ -1315,7 +1315,7 @@
                 <w:b w:val="0"/>
                 <w:sz w:val="18"/>
               </w:rPr>
-              <w:t>47,34</w:t>
+              <w:t>47,33</w:t>
             </w:r>
           </w:p>
         </w:tc>
@@ -1353,7 +1353,7 @@
                 <w:b w:val="0"/>
                 <w:sz w:val="18"/>
               </w:rPr>
-              <w:t>+176</w:t>
+              <w:t>+172</w:t>
             </w:r>
           </w:p>
         </w:tc>
@@ -1537,7 +1537,7 @@
                 <w:b/>
                 <w:sz w:val="18"/>
               </w:rPr>
-              <w:t>−0,35</w:t>
+              <w:t>−0,36</w:t>
             </w:r>
           </w:p>
         </w:tc>
@@ -1582,7 +1582,7 @@
                 <w:b/>
                 <w:sz w:val="18"/>
               </w:rPr>
-              <w:t>−352</w:t>
+              <w:t>−364</w:t>
             </w:r>
           </w:p>
         </w:tc>

</xml_diff>

<commit_message>
Compras: proxy com passagens e terceirização (3.3.90.33/.34), regra de dado inconsistente, recalibração e textos
Coleta complementar (3.3.50, 3.3.60, 3.3.90.33/.34/.36/.38) para testar a sensibilidade da proxy;
theta_M 37,3% e theta_E 4,8%; teto p99 R$ 10.075/hab; imputação de compras > 90% da despesa;
simulação alinhada à cadeia (média da UF sem renda, theta arredondado); Estudo 16 corrigido (omissão
das compras eleva a alíquota calculada); números dos textos e tabelas do Estudo 17 atualizados.

Co-Authored-By: Claude Sonnet 5.5 <noreply@anthropic.com>
Claude-Session: https://claude.ai/code/session_011eEoECqArDQbSEYFrfCHxJ
</commit_message>
<xml_diff>
--- a/data/auditoria-pr-validacao/tabelas-artigo/tabela-cenarios-receita-estadual-pr.docx
+++ b/data/auditoria-pr-validacao/tabelas-artigo/tabela-cenarios-receita-estadual-pr.docx
@@ -509,7 +509,7 @@
                 <w:b w:val="0"/>
                 <w:sz w:val="18"/>
               </w:rPr>
-              <w:t>−104</w:t>
+              <w:t>−103</w:t>
             </w:r>
           </w:p>
         </w:tc>
@@ -682,7 +682,7 @@
                 <w:b w:val="0"/>
                 <w:sz w:val="18"/>
               </w:rPr>
-              <w:t>44,05</w:t>
+              <w:t>44,06</w:t>
             </w:r>
           </w:p>
         </w:tc>
@@ -720,7 +720,7 @@
                 <w:b w:val="0"/>
                 <w:sz w:val="18"/>
               </w:rPr>
-              <w:t>−124</w:t>
+              <w:t>−123</w:t>
             </w:r>
           </w:p>
         </w:tc>
@@ -893,7 +893,7 @@
                 <w:b w:val="0"/>
                 <w:sz w:val="18"/>
               </w:rPr>
-              <w:t>45,00</w:t>
+              <w:t>45,01</w:t>
             </w:r>
           </w:p>
         </w:tc>
@@ -931,7 +931,7 @@
                 <w:b w:val="0"/>
                 <w:sz w:val="18"/>
               </w:rPr>
-              <w:t>−146</w:t>
+              <w:t>−144</w:t>
             </w:r>
           </w:p>
         </w:tc>
@@ -1142,7 +1142,7 @@
                 <w:b w:val="0"/>
                 <w:sz w:val="18"/>
               </w:rPr>
-              <w:t>−168</w:t>
+              <w:t>−165</w:t>
             </w:r>
           </w:p>
         </w:tc>
@@ -1353,7 +1353,7 @@
                 <w:b w:val="0"/>
                 <w:sz w:val="18"/>
               </w:rPr>
-              <w:t>+169</w:t>
+              <w:t>+173</w:t>
             </w:r>
           </w:p>
         </w:tc>
@@ -1537,7 +1537,7 @@
                 <w:b/>
                 <w:sz w:val="18"/>
               </w:rPr>
-              <w:t>−0,37</w:t>
+              <w:t>−0,36</w:t>
             </w:r>
           </w:p>
         </w:tc>
@@ -1582,7 +1582,7 @@
                 <w:b/>
                 <w:sz w:val="18"/>
               </w:rPr>
-              <w:t>−373</w:t>
+              <w:t>−362</w:t>
             </w:r>
           </w:p>
         </w:tc>

</xml_diff>

<commit_message>
Compras: f = 1,0 (TRU 2023 e cobertura da proxy), faixa 0,8-1,0; theta_M 43,0% e theta_E 6,0%
f estimado em data/estima-fracao-compras-carga.py: carga das compras do governo 5,5% a 8,5% acima da
das famílias e custeio da proxy a 2% do consumo intermediário das Contas Nacionais. Recalibração,
cadeia regenerada, textos e tabelas do Estudo 17, nota de parâmetros, Nota Metodológica e Estudo 16.

Co-Authored-By: Claude Sonnet 5.5 <noreply@anthropic.com>
Claude-Session: https://claude.ai/code/session_011eEoECqArDQbSEYFrfCHxJ
</commit_message>
<xml_diff>
--- a/data/auditoria-pr-validacao/tabelas-artigo/tabela-cenarios-receita-estadual-pr.docx
+++ b/data/auditoria-pr-validacao/tabelas-artigo/tabela-cenarios-receita-estadual-pr.docx
@@ -509,7 +509,7 @@
                 <w:b w:val="0"/>
                 <w:sz w:val="18"/>
               </w:rPr>
-              <w:t>−103</w:t>
+              <w:t>−104</w:t>
             </w:r>
           </w:p>
         </w:tc>
@@ -1142,7 +1142,7 @@
                 <w:b w:val="0"/>
                 <w:sz w:val="18"/>
               </w:rPr>
-              <w:t>−165</w:t>
+              <w:t>−166</w:t>
             </w:r>
           </w:p>
         </w:tc>
@@ -1353,7 +1353,7 @@
                 <w:b w:val="0"/>
                 <w:sz w:val="18"/>
               </w:rPr>
-              <w:t>+173</w:t>
+              <w:t>+172</w:t>
             </w:r>
           </w:p>
         </w:tc>
@@ -1582,7 +1582,7 @@
                 <w:b/>
                 <w:sz w:val="18"/>
               </w:rPr>
-              <w:t>−362</w:t>
+              <w:t>−365</w:t>
             </w:r>
           </w:p>
         </w:tc>

</xml_diff>

<commit_message>
Compras: média 2024-2025 a preços de 2025, União 2025, regra de dados, textos e figuras do artigo atualizadas
- data/build-compras-media.py: média dos anos disponíveis (ciclo eleitoral e lacunas de entrega)
- calibração e estimativa de f com DCA 2025 (União) e consumo intermediário a preços de 2025
- theta_M 41,6% e theta_E 6,0%; textos do Estudo 17, nota de parâmetros e Estudo 16
- mapa do artigo regenerado

Co-Authored-By: Claude Sonnet 5.5 <noreply@anthropic.com>
Claude-Session: https://claude.ai/code/session_011eEoECqArDQbSEYFrfCHxJ
</commit_message>
<xml_diff>
--- a/data/auditoria-pr-validacao/tabelas-artigo/tabela-cenarios-receita-estadual-pr.docx
+++ b/data/auditoria-pr-validacao/tabelas-artigo/tabela-cenarios-receita-estadual-pr.docx
@@ -509,7 +509,7 @@
                 <w:b w:val="0"/>
                 <w:sz w:val="18"/>
               </w:rPr>
-              <w:t>−104</w:t>
+              <w:t>−101</w:t>
             </w:r>
           </w:p>
         </w:tc>
@@ -720,7 +720,7 @@
                 <w:b w:val="0"/>
                 <w:sz w:val="18"/>
               </w:rPr>
-              <w:t>−123</w:t>
+              <w:t>−117</w:t>
             </w:r>
           </w:p>
         </w:tc>
@@ -893,7 +893,7 @@
                 <w:b w:val="0"/>
                 <w:sz w:val="18"/>
               </w:rPr>
-              <w:t>45,01</w:t>
+              <w:t>45,02</w:t>
             </w:r>
           </w:p>
         </w:tc>
@@ -931,7 +931,7 @@
                 <w:b w:val="0"/>
                 <w:sz w:val="18"/>
               </w:rPr>
-              <w:t>−144</w:t>
+              <w:t>−135</w:t>
             </w:r>
           </w:p>
         </w:tc>
@@ -1104,7 +1104,7 @@
                 <w:b w:val="0"/>
                 <w:sz w:val="18"/>
               </w:rPr>
-              <w:t>45,98</w:t>
+              <w:t>45,99</w:t>
             </w:r>
           </w:p>
         </w:tc>
@@ -1123,7 +1123,7 @@
                 <w:b w:val="0"/>
                 <w:sz w:val="18"/>
               </w:rPr>
-              <w:t>−0,4</w:t>
+              <w:t>−0,3</w:t>
             </w:r>
           </w:p>
         </w:tc>
@@ -1142,7 +1142,7 @@
                 <w:b w:val="0"/>
                 <w:sz w:val="18"/>
               </w:rPr>
-              <w:t>−166</w:t>
+              <w:t>−153</w:t>
             </w:r>
           </w:p>
         </w:tc>
@@ -1315,7 +1315,7 @@
                 <w:b w:val="0"/>
                 <w:sz w:val="18"/>
               </w:rPr>
-              <w:t>47,33</w:t>
+              <w:t>47,35</w:t>
             </w:r>
           </w:p>
         </w:tc>
@@ -1353,7 +1353,7 @@
                 <w:b w:val="0"/>
                 <w:sz w:val="18"/>
               </w:rPr>
-              <w:t>+172</w:t>
+              <w:t>+188</w:t>
             </w:r>
           </w:p>
         </w:tc>
@@ -1537,7 +1537,7 @@
                 <w:b/>
                 <w:sz w:val="18"/>
               </w:rPr>
-              <w:t>−0,36</w:t>
+              <w:t>−0,32</w:t>
             </w:r>
           </w:p>
         </w:tc>
@@ -1582,7 +1582,7 @@
                 <w:b/>
                 <w:sz w:val="18"/>
               </w:rPr>
-              <w:t>−365</w:t>
+              <w:t>−320</w:t>
             </w:r>
           </w:p>
         </w:tc>

</xml_diff>

<commit_message>
φ de destino robusto e 2026 estimado (nowcast) no coeficiente histórico; cadeia, painel e estudos regenerados
Co-Authored-By: Claude Sonnet 5.5 <noreply@anthropic.com>
Claude-Session: https://claude.ai/code/session_011eEoECqArDQbSEYFrfCHxJ
</commit_message>
<xml_diff>
--- a/data/auditoria-pr-validacao/tabelas-artigo/tabela-cenarios-receita-estadual-pr.docx
+++ b/data/auditoria-pr-validacao/tabelas-artigo/tabela-cenarios-receita-estadual-pr.docx
@@ -471,7 +471,64 @@
                 <w:b w:val="0"/>
                 <w:sz w:val="18"/>
               </w:rPr>
-              <w:t>43,21</w:t>
+              <w:t>43,26</w:t>
+            </w:r>
+          </w:p>
+        </w:tc>
+        <w:tc>
+          <w:tcPr>
+            <w:tcW w:type="dxa" w:w="765"/>
+          </w:tcPr>
+          <w:p>
+            <w:pPr>
+              <w:spacing w:after="0" w:before="20"/>
+              <w:jc w:val="right"/>
+            </w:pPr>
+            <w:r/>
+            <w:r>
+              <w:rPr>
+                <w:b w:val="0"/>
+                <w:sz w:val="18"/>
+              </w:rPr>
+              <w:t>−0,1</w:t>
+            </w:r>
+          </w:p>
+        </w:tc>
+        <w:tc>
+          <w:tcPr>
+            <w:tcW w:type="dxa" w:w="907"/>
+          </w:tcPr>
+          <w:p>
+            <w:pPr>
+              <w:spacing w:after="0" w:before="20"/>
+              <w:jc w:val="right"/>
+            </w:pPr>
+            <w:r/>
+            <w:r>
+              <w:rPr>
+                <w:b w:val="0"/>
+                <w:sz w:val="18"/>
+              </w:rPr>
+              <w:t>−52</w:t>
+            </w:r>
+          </w:p>
+        </w:tc>
+        <w:tc>
+          <w:tcPr>
+            <w:tcW w:type="dxa" w:w="850"/>
+          </w:tcPr>
+          <w:p>
+            <w:pPr>
+              <w:spacing w:after="0" w:before="20"/>
+              <w:jc w:val="right"/>
+            </w:pPr>
+            <w:r/>
+            <w:r>
+              <w:rPr>
+                <w:b w:val="0"/>
+                <w:sz w:val="18"/>
+              </w:rPr>
+              <w:t>43,22</w:t>
             </w:r>
           </w:p>
         </w:tc>
@@ -509,7 +566,7 @@
                 <w:b w:val="0"/>
                 <w:sz w:val="18"/>
               </w:rPr>
-              <w:t>−101</w:t>
+              <w:t>−91</w:t>
             </w:r>
           </w:p>
         </w:tc>
@@ -528,7 +585,7 @@
                 <w:b w:val="0"/>
                 <w:sz w:val="18"/>
               </w:rPr>
-              <w:t>43,24</w:t>
+              <w:t>43,31</w:t>
             </w:r>
           </w:p>
         </w:tc>
@@ -547,7 +604,7 @@
                 <w:b w:val="0"/>
                 <w:sz w:val="18"/>
               </w:rPr>
-              <w:t>−0,2</w:t>
+              <w:t>−0,0</w:t>
             </w:r>
           </w:p>
         </w:tc>
@@ -566,64 +623,7 @@
                 <w:b w:val="0"/>
                 <w:sz w:val="18"/>
               </w:rPr>
-              <w:t>−77</w:t>
-            </w:r>
-          </w:p>
-        </w:tc>
-        <w:tc>
-          <w:tcPr>
-            <w:tcW w:type="dxa" w:w="850"/>
-          </w:tcPr>
-          <w:p>
-            <w:pPr>
-              <w:spacing w:after="0" w:before="20"/>
-              <w:jc w:val="right"/>
-            </w:pPr>
-            <w:r/>
-            <w:r>
-              <w:rPr>
-                <w:b w:val="0"/>
-                <w:sz w:val="18"/>
-              </w:rPr>
-              <w:t>43,32</w:t>
-            </w:r>
-          </w:p>
-        </w:tc>
-        <w:tc>
-          <w:tcPr>
-            <w:tcW w:type="dxa" w:w="765"/>
-          </w:tcPr>
-          <w:p>
-            <w:pPr>
-              <w:spacing w:after="0" w:before="20"/>
-              <w:jc w:val="right"/>
-            </w:pPr>
-            <w:r/>
-            <w:r>
-              <w:rPr>
-                <w:b w:val="0"/>
-                <w:sz w:val="18"/>
-              </w:rPr>
-              <w:t>+0,0</w:t>
-            </w:r>
-          </w:p>
-        </w:tc>
-        <w:tc>
-          <w:tcPr>
-            <w:tcW w:type="dxa" w:w="907"/>
-          </w:tcPr>
-          <w:p>
-            <w:pPr>
-              <w:spacing w:after="0" w:before="20"/>
-              <w:jc w:val="right"/>
-            </w:pPr>
-            <w:r/>
-            <w:r>
-              <w:rPr>
-                <w:b w:val="0"/>
-                <w:sz w:val="18"/>
-              </w:rPr>
-              <w:t>+11</w:t>
+              <w:t>−3</w:t>
             </w:r>
           </w:p>
         </w:tc>
@@ -682,7 +682,7 @@
                 <w:b w:val="0"/>
                 <w:sz w:val="18"/>
               </w:rPr>
-              <w:t>44,06</w:t>
+              <w:t>44,16</w:t>
             </w:r>
           </w:p>
         </w:tc>
@@ -701,7 +701,7 @@
                 <w:b w:val="0"/>
                 <w:sz w:val="18"/>
               </w:rPr>
-              <w:t>−0,3</w:t>
+              <w:t>−0,0</w:t>
             </w:r>
           </w:p>
         </w:tc>
@@ -720,7 +720,7 @@
                 <w:b w:val="0"/>
                 <w:sz w:val="18"/>
               </w:rPr>
-              <w:t>−117</w:t>
+              <w:t>−16</w:t>
             </w:r>
           </w:p>
         </w:tc>
@@ -739,7 +739,7 @@
                 <w:b w:val="0"/>
                 <w:sz w:val="18"/>
               </w:rPr>
-              <w:t>44,11</w:t>
+              <w:t>44,08</w:t>
             </w:r>
           </w:p>
         </w:tc>
@@ -777,7 +777,7 @@
                 <w:b w:val="0"/>
                 <w:sz w:val="18"/>
               </w:rPr>
-              <w:t>−69</w:t>
+              <w:t>−98</w:t>
             </w:r>
           </w:p>
         </w:tc>
@@ -796,7 +796,7 @@
                 <w:b w:val="0"/>
                 <w:sz w:val="18"/>
               </w:rPr>
-              <w:t>44,29</w:t>
+              <w:t>44,26</w:t>
             </w:r>
           </w:p>
         </w:tc>
@@ -815,7 +815,7 @@
                 <w:b w:val="0"/>
                 <w:sz w:val="18"/>
               </w:rPr>
-              <w:t>+0,3</w:t>
+              <w:t>+0,2</w:t>
             </w:r>
           </w:p>
         </w:tc>
@@ -834,7 +834,7 @@
                 <w:b w:val="0"/>
                 <w:sz w:val="18"/>
               </w:rPr>
-              <w:t>+113</w:t>
+              <w:t>+83</w:t>
             </w:r>
           </w:p>
         </w:tc>
@@ -893,7 +893,7 @@
                 <w:b w:val="0"/>
                 <w:sz w:val="18"/>
               </w:rPr>
-              <w:t>45,02</w:t>
+              <w:t>45,17</w:t>
             </w:r>
           </w:p>
         </w:tc>
@@ -912,7 +912,7 @@
                 <w:b w:val="0"/>
                 <w:sz w:val="18"/>
               </w:rPr>
-              <w:t>−0,3</w:t>
+              <w:t>+0,0</w:t>
             </w:r>
           </w:p>
         </w:tc>
@@ -931,7 +931,7 @@
                 <w:b w:val="0"/>
                 <w:sz w:val="18"/>
               </w:rPr>
-              <w:t>−135</w:t>
+              <w:t>+20</w:t>
             </w:r>
           </w:p>
         </w:tc>
@@ -950,7 +950,7 @@
                 <w:b w:val="0"/>
                 <w:sz w:val="18"/>
               </w:rPr>
-              <w:t>45,09</w:t>
+              <w:t>45,05</w:t>
             </w:r>
           </w:p>
         </w:tc>
@@ -969,7 +969,7 @@
                 <w:b w:val="0"/>
                 <w:sz w:val="18"/>
               </w:rPr>
-              <w:t>−0,1</w:t>
+              <w:t>−0,2</w:t>
             </w:r>
           </w:p>
         </w:tc>
@@ -988,7 +988,7 @@
                 <w:b w:val="0"/>
                 <w:sz w:val="18"/>
               </w:rPr>
-              <w:t>−61</w:t>
+              <w:t>−106</w:t>
             </w:r>
           </w:p>
         </w:tc>
@@ -1007,7 +1007,7 @@
                 <w:b w:val="0"/>
                 <w:sz w:val="18"/>
               </w:rPr>
-              <w:t>45,37</w:t>
+              <w:t>45,32</w:t>
             </w:r>
           </w:p>
         </w:tc>
@@ -1026,7 +1026,7 @@
                 <w:b w:val="0"/>
                 <w:sz w:val="18"/>
               </w:rPr>
-              <w:t>+0,5</w:t>
+              <w:t>+0,4</w:t>
             </w:r>
           </w:p>
         </w:tc>
@@ -1045,7 +1045,7 @@
                 <w:b w:val="0"/>
                 <w:sz w:val="18"/>
               </w:rPr>
-              <w:t>+218</w:t>
+              <w:t>+173</w:t>
             </w:r>
           </w:p>
         </w:tc>
@@ -1104,7 +1104,7 @@
                 <w:b w:val="0"/>
                 <w:sz w:val="18"/>
               </w:rPr>
-              <w:t>45,99</w:t>
+              <w:t>46,20</w:t>
             </w:r>
           </w:p>
         </w:tc>
@@ -1123,7 +1123,7 @@
                 <w:b w:val="0"/>
                 <w:sz w:val="18"/>
               </w:rPr>
-              <w:t>−0,3</w:t>
+              <w:t>+0,1</w:t>
             </w:r>
           </w:p>
         </w:tc>
@@ -1142,7 +1142,7 @@
                 <w:b w:val="0"/>
                 <w:sz w:val="18"/>
               </w:rPr>
-              <w:t>−153</w:t>
+              <w:t>+59</w:t>
             </w:r>
           </w:p>
         </w:tc>
@@ -1161,7 +1161,7 @@
                 <w:b w:val="0"/>
                 <w:sz w:val="18"/>
               </w:rPr>
-              <w:t>46,09</w:t>
+              <w:t>46,03</w:t>
             </w:r>
           </w:p>
         </w:tc>
@@ -1180,7 +1180,7 @@
                 <w:b w:val="0"/>
                 <w:sz w:val="18"/>
               </w:rPr>
-              <w:t>−0,1</w:t>
+              <w:t>−0,2</w:t>
             </w:r>
           </w:p>
         </w:tc>
@@ -1199,7 +1199,7 @@
                 <w:b w:val="0"/>
                 <w:sz w:val="18"/>
               </w:rPr>
-              <w:t>−51</w:t>
+              <w:t>−113</w:t>
             </w:r>
           </w:p>
         </w:tc>
@@ -1218,7 +1218,7 @@
                 <w:b w:val="0"/>
                 <w:sz w:val="18"/>
               </w:rPr>
-              <w:t>46,47</w:t>
+              <w:t>46,41</w:t>
             </w:r>
           </w:p>
         </w:tc>
@@ -1237,7 +1237,7 @@
                 <w:b w:val="0"/>
                 <w:sz w:val="18"/>
               </w:rPr>
-              <w:t>+0,7</w:t>
+              <w:t>+0,6</w:t>
             </w:r>
           </w:p>
         </w:tc>
@@ -1256,7 +1256,7 @@
                 <w:b w:val="0"/>
                 <w:sz w:val="18"/>
               </w:rPr>
-              <w:t>+330</w:t>
+              <w:t>+268</w:t>
             </w:r>
           </w:p>
         </w:tc>
@@ -1315,7 +1315,7 @@
                 <w:b w:val="0"/>
                 <w:sz w:val="18"/>
               </w:rPr>
-              <w:t>47,35</w:t>
+              <w:t>47,52</w:t>
             </w:r>
           </w:p>
         </w:tc>
@@ -1334,7 +1334,7 @@
                 <w:b w:val="0"/>
                 <w:sz w:val="18"/>
               </w:rPr>
-              <w:t>+0,4</w:t>
+              <w:t>+0,8</w:t>
             </w:r>
           </w:p>
         </w:tc>
@@ -1353,7 +1353,7 @@
                 <w:b w:val="0"/>
                 <w:sz w:val="18"/>
               </w:rPr>
-              <w:t>+188</w:t>
+              <w:t>+361</w:t>
             </w:r>
           </w:p>
         </w:tc>
@@ -1372,7 +1372,7 @@
                 <w:b w:val="0"/>
                 <w:sz w:val="18"/>
               </w:rPr>
-              <w:t>47,48</w:t>
+              <w:t>47,30</w:t>
             </w:r>
           </w:p>
         </w:tc>
@@ -1391,7 +1391,7 @@
                 <w:b w:val="0"/>
                 <w:sz w:val="18"/>
               </w:rPr>
-              <w:t>+0,7</w:t>
+              <w:t>+0,3</w:t>
             </w:r>
           </w:p>
         </w:tc>
@@ -1410,7 +1410,7 @@
                 <w:b w:val="0"/>
                 <w:sz w:val="18"/>
               </w:rPr>
-              <w:t>+319</w:t>
+              <w:t>+141</w:t>
             </w:r>
           </w:p>
         </w:tc>
@@ -1429,7 +1429,7 @@
                 <w:b w:val="0"/>
                 <w:sz w:val="18"/>
               </w:rPr>
-              <w:t>47,97</w:t>
+              <w:t>47,79</w:t>
             </w:r>
           </w:p>
         </w:tc>
@@ -1448,7 +1448,7 @@
                 <w:b w:val="0"/>
                 <w:sz w:val="18"/>
               </w:rPr>
-              <w:t>+1,7</w:t>
+              <w:t>+1,3</w:t>
             </w:r>
           </w:p>
         </w:tc>
@@ -1467,7 +1467,7 @@
                 <w:b w:val="0"/>
                 <w:sz w:val="18"/>
               </w:rPr>
-              <w:t>+807</w:t>
+              <w:t>+629</w:t>
             </w:r>
           </w:p>
         </w:tc>
@@ -1537,7 +1537,7 @@
                 <w:b/>
                 <w:sz w:val="18"/>
               </w:rPr>
-              <w:t>−0,32</w:t>
+              <w:t>+0,37</w:t>
             </w:r>
           </w:p>
         </w:tc>
@@ -1582,7 +1582,7 @@
                 <w:b/>
                 <w:sz w:val="18"/>
               </w:rPr>
-              <w:t>−320</w:t>
+              <w:t>+373</w:t>
             </w:r>
           </w:p>
         </w:tc>
@@ -1605,7 +1605,7 @@
                 <w:b/>
                 <w:sz w:val="18"/>
               </w:rPr>
-              <w:t>+0,06</w:t>
+              <w:t>−0,27</w:t>
             </w:r>
           </w:p>
         </w:tc>
@@ -1650,7 +1650,7 @@
                 <w:b/>
                 <w:sz w:val="18"/>
               </w:rPr>
-              <w:t>+61</w:t>
+              <w:t>−266</w:t>
             </w:r>
           </w:p>
         </w:tc>
@@ -1673,7 +1673,7 @@
                 <w:b/>
                 <w:sz w:val="18"/>
               </w:rPr>
-              <w:t>+1,48</w:t>
+              <w:t>+1,15</w:t>
             </w:r>
           </w:p>
         </w:tc>
@@ -1718,7 +1718,7 @@
                 <w:b/>
                 <w:sz w:val="18"/>
               </w:rPr>
-              <w:t>+1.478</w:t>
+              <w:t>+1.151</w:t>
             </w:r>
           </w:p>
         </w:tc>

</xml_diff>

<commit_message>
Regenera a cadeia sobre a coleta de ISS do main e atualiza o rótulo do composto na tabela de cenários
Co-Authored-By: Claude Sonnet 5.5 <noreply@anthropic.com>
Claude-Session: https://claude.ai/code/session_011eEoECqArDQbSEYFrfCHxJ
</commit_message>
<xml_diff>
--- a/data/auditoria-pr-validacao/tabelas-artigo/tabela-cenarios-receita-estadual-pr.docx
+++ b/data/auditoria-pr-validacao/tabelas-artigo/tabela-cenarios-receita-estadual-pr.docx
@@ -120,7 +120,7 @@
               <w:rPr>
                 <w:sz w:val="15"/>
               </w:rPr>
-              <w:t>POF/Censo</w:t>
+              <w:t>Composto POF/Censo/PNAD</w:t>
             </w:r>
           </w:p>
         </w:tc>
@@ -1007,7 +1007,7 @@
                 <w:b w:val="0"/>
                 <w:sz w:val="18"/>
               </w:rPr>
-              <w:t>45,32</w:t>
+              <w:t>45,33</w:t>
             </w:r>
           </w:p>
         </w:tc>
@@ -1085,7 +1085,7 @@
                 <w:b w:val="0"/>
                 <w:sz w:val="18"/>
               </w:rPr>
-              <w:t>46,14</w:t>
+              <w:t>46,15</w:t>
             </w:r>
           </w:p>
         </w:tc>
@@ -1733,7 +1733,7 @@
           <w:i w:val="0"/>
           <w:sz w:val="16"/>
         </w:rPr>
-        <w:t>Nota: Ref. é a receita estadual projetada sem a reforma (participação neutra de 2025 do ente estadual, ICMS + FECOP, líquido de cota-parte, aplicada à receita de referência nacional de cada ano, em R$ bilhões de 2025). Δ% e Δ R$ mi comparam a receita projetada com a referência do mesmo ano; Acum. soma os cinco anos. Os cenários diferem apenas na fonte do coeficiente de destino: estimativa própria com POF e Censo; neutro (destino igual à participação de origem, referência e não previsão; o histórico de transição continua valendo); e Gobetti e Monteiro (2023, Tabela 1). O Paraná não recebe repasse do Seguro-Receita na esfera estadual.</w:t>
+        <w:t>Nota: Ref. é a receita estadual projetada sem a reforma (participação neutra de 2025 do ente estadual, ICMS + FECOP, líquido de cota-parte, aplicada à receita de referência nacional de cada ano, em R$ bilhões de 2025). Δ% e Δ R$ mi comparam a receita projetada com a referência do mesmo ano; Acum. soma os cinco anos. Os cenários diferem apenas na fonte do coeficiente de destino: estimativa própria (composto de POF, Censo e PNAD Contínua); neutro (destino igual à participação de origem, referência e não previsão; o histórico de transição continua valendo); e Gobetti e Monteiro (2023, Tabela 1). O Paraná não recebe repasse do Seguro-Receita na esfera estadual.</w:t>
       </w:r>
     </w:p>
     <w:p>

</xml_diff>